<commit_message>
Informe: agregar enlace al repositorio en portada y anexo
Co-Authored-By: Claude Opus 5.5 <noreply@anthropic.com>
</commit_message>
<xml_diff>
--- a/Segunda_Entrega_Informe.docx
+++ b/Segunda_Entrega_Informe.docx
@@ -201,7 +201,7 @@
           <w:color w:val="52514E"/>
           <w:sz w:val="18"/>
         </w:rPr>
-        <w:t xml:space="preserve"> (anexo).</w:t>
+        <w:t xml:space="preserve"> (anexo) · Repositorio: https://github.com/danielo2858-spec/ml1-localizacion-qaknn</w:t>
       </w:r>
     </w:p>
     <w:p>
@@ -5114,7 +5114,7 @@
         <w:rPr>
           <w:sz w:val="20"/>
         </w:rPr>
-        <w:t xml:space="preserve"> (piloto).</w:t>
+        <w:t xml:space="preserve"> (piloto). Repositorio con todo el proyecto: https://github.com/danielo2858-spec/ml1-localizacion-qaknn</w:t>
       </w:r>
     </w:p>
     <w:p>

</xml_diff>